<commit_message>
Remove DII clause from R7 — FII-only selling signal
R7 now triggers and exits on FII flow data alone. DII condition
removed from trigger, yellow alert, exit conditions, weekly decision
tree, DB schema, data feed spec, and conflict resolution across
Algorithms.md, Implementation_Requirements.md, and the .docx.

Co-Authored-By: Claude Sonnet 4.6 <noreply@anthropic.com>
</commit_message>
<xml_diff>
--- a/docs/plan/Decision_Algo_DB_Project_May2026.docx
+++ b/docs/plan/Decision_Algo_DB_Project_May2026.docx
@@ -8625,7 +8625,7 @@
           <w:sz w:val="36"/>
           <w:szCs w:val="36"/>
         </w:rPr>
-        <w:t xml:space="preserve">R7  —  INSTITUTIONAL SELLING AS A BUY SIGNAL (Contrarian)</w:t>
+        <w:t>R7  —  FII SELLING SIGNAL</w:t>
       </w:r>
     </w:p>
     <w:p>
@@ -8741,10 +8741,13 @@
                 <w:sz w:val="17"/>
                 <w:szCs w:val="17"/>
               </w:rPr>
-              <w:t xml:space="preserve">FII Net Equity Investment (Rs. Crore) per calendar month
-Net = Gross Buy MINUS Gross Sell, equity cash segment only
-Excludes: F&amp;O, debt, hybrid
-Source: https://www.nseindia.com/market-data/fii-dii-activity</w:t>
+              <w:t>FII Net Equity Investment (Rs. Crore) per calendar month</w:t>
+              <w:br/>
+              <w:t>Net = Gross Buy MINUS Gross Sell, equity cash segment only</w:t>
+              <w:br/>
+              <w:t>Excludes: F&amp;O, debt, hybrid</w:t>
+              <w:br/>
+              <w:t>Source: NSDL FPI Yearwise report (fpi.nsdl.co.in)</w:t>
             </w:r>
           </w:p>
         </w:tc>
@@ -8972,156 +8975,6 @@
               <w:t xml:space="preserve">outflow_threshold = fii_peak_inflow * 0.25
 Recalculated every month alongside fii_peak_inflow.
 Example: fii_peak_inflow=Rs.35,000 Cr → threshold=Rs.8,750 Cr</w:t>
-            </w:r>
-          </w:p>
-        </w:tc>
-      </w:tr>
-      <w:tr>
-        <w:tc>
-          <w:tcPr>
-            <w:tcW w:type="dxa" w:w="2800"/>
-            <w:gridSpan w:val="1"/>
-            <w:tcBorders>
-              <w:top w:val="single" w:color="B8C4D0" w:sz="1"/>
-              <w:left w:val="single" w:color="B8C4D0" w:sz="1"/>
-              <w:bottom w:val="single" w:color="B8C4D0" w:sz="1"/>
-              <w:right w:val="single" w:color="B8C4D0" w:sz="1"/>
-            </w:tcBorders>
-            <w:shd w:fill="F2F2F2" w:val="clear"/>
-            <w:tcMar>
-              <w:top w:type="dxa" w:w="80"/>
-              <w:left w:type="dxa" w:w="120"/>
-              <w:bottom w:type="dxa" w:w="80"/>
-              <w:right w:type="dxa" w:w="120"/>
-            </w:tcMar>
-            <w:vAlign w:val="center"/>
-          </w:tcPr>
-          <w:p>
-            <w:pPr>
-              <w:jc w:val="left"/>
-            </w:pPr>
-            <w:r>
-              <w:rPr>
-                <w:rFonts w:ascii="Arial" w:cs="Arial" w:eastAsia="Arial" w:hAnsi="Arial"/>
-                <w:b/>
-                <w:bCs/>
-                <w:color w:val="000000"/>
-                <w:sz w:val="17"/>
-                <w:szCs w:val="17"/>
-              </w:rPr>
-              <w:t xml:space="preserve">dii_net_monthly</w:t>
-            </w:r>
-          </w:p>
-        </w:tc>
-        <w:tc>
-          <w:tcPr>
-            <w:tcW w:type="dxa" w:w="6560"/>
-            <w:gridSpan w:val="1"/>
-            <w:tcBorders>
-              <w:top w:val="single" w:color="B8C4D0" w:sz="1"/>
-              <w:left w:val="single" w:color="B8C4D0" w:sz="1"/>
-              <w:bottom w:val="single" w:color="B8C4D0" w:sz="1"/>
-              <w:right w:val="single" w:color="B8C4D0" w:sz="1"/>
-            </w:tcBorders>
-            <w:shd w:fill="FFFFFF" w:val="clear"/>
-            <w:tcMar>
-              <w:top w:type="dxa" w:w="80"/>
-              <w:left w:type="dxa" w:w="120"/>
-              <w:bottom w:type="dxa" w:w="80"/>
-              <w:right w:type="dxa" w:w="120"/>
-            </w:tcMar>
-            <w:vAlign w:val="center"/>
-          </w:tcPr>
-          <w:p>
-            <w:pPr>
-              <w:jc w:val="left"/>
-            </w:pPr>
-            <w:r>
-              <w:rPr>
-                <w:rFonts w:ascii="Arial" w:cs="Arial" w:eastAsia="Arial" w:hAnsi="Arial"/>
-                <w:b w:val="false"/>
-                <w:bCs w:val="false"/>
-                <w:color w:val="000000"/>
-                <w:sz w:val="17"/>
-                <w:szCs w:val="17"/>
-              </w:rPr>
-              <w:t xml:space="preserve">DII Net Equity Investment (Rs. Crore) per calendar month
-Net = Gross Buy MINUS Gross Sell, equity cash only. Same source.</w:t>
-            </w:r>
-          </w:p>
-        </w:tc>
-      </w:tr>
-      <w:tr>
-        <w:tc>
-          <w:tcPr>
-            <w:tcW w:type="dxa" w:w="2800"/>
-            <w:gridSpan w:val="1"/>
-            <w:tcBorders>
-              <w:top w:val="single" w:color="B8C4D0" w:sz="1"/>
-              <w:left w:val="single" w:color="B8C4D0" w:sz="1"/>
-              <w:bottom w:val="single" w:color="B8C4D0" w:sz="1"/>
-              <w:right w:val="single" w:color="B8C4D0" w:sz="1"/>
-            </w:tcBorders>
-            <w:shd w:fill="F2F2F2" w:val="clear"/>
-            <w:tcMar>
-              <w:top w:type="dxa" w:w="80"/>
-              <w:left w:type="dxa" w:w="120"/>
-              <w:bottom w:type="dxa" w:w="80"/>
-              <w:right w:type="dxa" w:w="120"/>
-            </w:tcMar>
-            <w:vAlign w:val="center"/>
-          </w:tcPr>
-          <w:p>
-            <w:pPr>
-              <w:jc w:val="left"/>
-            </w:pPr>
-            <w:r>
-              <w:rPr>
-                <w:rFonts w:ascii="Arial" w:cs="Arial" w:eastAsia="Arial" w:hAnsi="Arial"/>
-                <w:b/>
-                <w:bCs/>
-                <w:color w:val="000000"/>
-                <w:sz w:val="17"/>
-                <w:szCs w:val="17"/>
-              </w:rPr>
-              <w:t xml:space="preserve">dii_3m_sum</w:t>
-            </w:r>
-          </w:p>
-        </w:tc>
-        <w:tc>
-          <w:tcPr>
-            <w:tcW w:type="dxa" w:w="6560"/>
-            <w:gridSpan w:val="1"/>
-            <w:tcBorders>
-              <w:top w:val="single" w:color="B8C4D0" w:sz="1"/>
-              <w:left w:val="single" w:color="B8C4D0" w:sz="1"/>
-              <w:bottom w:val="single" w:color="B8C4D0" w:sz="1"/>
-              <w:right w:val="single" w:color="B8C4D0" w:sz="1"/>
-            </w:tcBorders>
-            <w:shd w:fill="FFFFFF" w:val="clear"/>
-            <w:tcMar>
-              <w:top w:type="dxa" w:w="80"/>
-              <w:left w:type="dxa" w:w="120"/>
-              <w:bottom w:type="dxa" w:w="80"/>
-              <w:right w:type="dxa" w:w="120"/>
-            </w:tcMar>
-            <w:vAlign w:val="center"/>
-          </w:tcPr>
-          <w:p>
-            <w:pPr>
-              <w:jc w:val="left"/>
-            </w:pPr>
-            <w:r>
-              <w:rPr>
-                <w:rFonts w:ascii="Arial" w:cs="Arial" w:eastAsia="Arial" w:hAnsi="Arial"/>
-                <w:b w:val="false"/>
-                <w:bCs w:val="false"/>
-                <w:color w:val="000000"/>
-                <w:sz w:val="17"/>
-                <w:szCs w:val="17"/>
-              </w:rPr>
-              <w:t xml:space="preserve">Sum of DII net flows for most recent 3 complete calendar months
-If positive → DII is net buyer over 3 months</w:t>
             </w:r>
           </w:p>
         </w:tc>
@@ -9280,7 +9133,6 @@
                 <w:sz w:val="17"/>
                 <w:szCs w:val="17"/>
               </w:rPr>
-              <w:t xml:space="preserve">dii_positive_check = (dii_3m_sum &gt; 0)</w:t>
             </w:r>
           </w:p>
           <w:p>
@@ -9308,7 +9160,7 @@
                 <w:sz w:val="17"/>
                 <w:szCs w:val="17"/>
               </w:rPr>
-              <w:t xml:space="preserve">IF fii_outflow_check == TRUE AND dii_positive_check == TRUE</w:t>
+              <w:t>IF fii_outflow_check == TRUE</w:t>
             </w:r>
           </w:p>
           <w:p>
@@ -9579,7 +9431,6 @@
                 <w:sz w:val="17"/>
                 <w:szCs w:val="17"/>
               </w:rPr>
-              <w:t xml:space="preserve">   AND dii_3m_sum &gt; 0</w:t>
             </w:r>
           </w:p>
           <w:p>
@@ -9607,7 +9458,7 @@
                 <w:sz w:val="17"/>
                 <w:szCs w:val="17"/>
               </w:rPr>
-              <w:t xml:space="preserve">     LOG: fii_3m_cumulative, dii_3m_sum, fii_peak_inflow, outflow_threshold, date</w:t>
+              <w:t xml:space="preserve">     LOG: fii_3m_cumulative, fii_peak_inflow, outflow_threshold, date</w:t>
             </w:r>
           </w:p>
           <w:p>
@@ -9738,35 +9589,7 @@
                 <w:sz w:val="17"/>
                 <w:szCs w:val="17"/>
               </w:rPr>
-              <w:t xml:space="preserve">  (b) dii_3m_sum turns negative (DII stops supporting the market)</w:t>
-            </w:r>
-          </w:p>
-          <w:p>
-            <w:pPr>
-              <w:spacing w:after="20" w:before="20"/>
-            </w:pPr>
-            <w:r>
-              <w:rPr>
-                <w:rFonts w:ascii="Courier New" w:cs="Courier New" w:eastAsia="Courier New" w:hAnsi="Courier New"/>
-                <w:color w:val="1F3864"/>
-                <w:sz w:val="17"/>
-                <w:szCs w:val="17"/>
-              </w:rPr>
-              <w:t xml:space="preserve">  OR</w:t>
-            </w:r>
-          </w:p>
-          <w:p>
-            <w:pPr>
-              <w:spacing w:after="20" w:before="20"/>
-            </w:pPr>
-            <w:r>
-              <w:rPr>
-                <w:rFonts w:ascii="Courier New" w:cs="Courier New" w:eastAsia="Courier New" w:hAnsi="Courier New"/>
-                <w:color w:val="1F3864"/>
-                <w:sz w:val="17"/>
-                <w:szCs w:val="17"/>
-              </w:rPr>
-              <w:t xml:space="preserve">  (c) ABS(fii_3m_cumulative) &lt; outflow_threshold after monthly recalculation</w:t>
+              <w:t xml:space="preserve">  (b) ABS(fii_3m_cumulative) &lt; outflow_threshold after monthly recalculation</w:t>
             </w:r>
           </w:p>
           <w:p>
@@ -11623,7 +11446,7 @@
                 <w:sz w:val="17"/>
                 <w:szCs w:val="17"/>
               </w:rPr>
-              <w:t xml:space="preserve">R7 active: FIIs are selling heavily (3m cumulative outflow &gt;= 25% of peak inflow) while DIIs are buying — institutional divergence signal.</w:t>
+              <w:t>R7 active: FIIs are selling heavily (3m cumulative outflow &gt;= 25% of peak inflow) — significant foreign-driven dislocation.</w:t>
             </w:r>
           </w:p>
           <w:p>
@@ -11636,7 +11459,7 @@
                 <w:sz w:val="17"/>
                 <w:szCs w:val="17"/>
               </w:rPr>
-              <w:t xml:space="preserve">Together, this combination signals a macro stress environment with monetary tightening pressure, real rate compression of equities, and foreign institutional selling. The DII buying provides a domestic support floor.</w:t>
+              <w:t>Together, this combination signals a macro stress environment with monetary tightening pressure, real rate compression of equities, and foreign institutional selling.</w:t>
             </w:r>
           </w:p>
           <w:p>
@@ -11665,7 +11488,7 @@
                 <w:sz w:val="17"/>
                 <w:szCs w:val="17"/>
               </w:rPr>
-              <w:t xml:space="preserve">Rationale: R1 pushes toward Gold; R7 pushes toward equity via SIP; R2 enforces 30% Gold floor. The competing signals balance to a neutral allocation. State 2 is the stable default that satisfies the 30% Gold floor while acknowledging the DII buy signal.</w:t>
+              <w:t>Rationale: R1 pushes toward Gold; R7 pushes toward equity via SIP; R2 enforces 30% Gold floor. The competing signals balance to a neutral allocation. State 2 is the stable default that satisfies the 30% Gold floor.</w:t>
             </w:r>
           </w:p>
           <w:p>
@@ -12949,7 +12772,7 @@
                 <w:sz w:val="16"/>
                 <w:szCs w:val="16"/>
               </w:rPr>
-              <w:t xml:space="preserve">fii_3m_cumulative &lt; 0 AND ABS(fii_3m) &gt;= fii_peak_inflow * 0.25 AND dii_3m_sum &gt; 0 (Recalculate peak_inflow monthly using trailing 24 calendar months)</w:t>
+              <w:t>fii_3m_cumulative &lt; 0 AND ABS(fii_3m) &gt;= fii_peak_inflow * 0.25 (Recalculate peak_inflow monthly using trailing 24 calendar months)</w:t>
             </w:r>
           </w:p>
         </w:tc>

</xml_diff>